<commit_message>
Fix firmware lock document layout
</commit_message>
<xml_diff>
--- a/docs/EVT_PRE_20_FIRMWARE_LOCK_INTERLOCK_REV_A.docx
+++ b/docs/EVT_PRE_20_FIRMWARE_LOCK_INTERLOCK_REV_A.docx
@@ -118,7 +118,8 @@
     <w:p>
       <w:pPr>
         <w:pStyle w:val="Heading1"/>
-        <w:spacing w:line="240" w:lineRule="auto" w:before="160" w:after="40"/>
+        <w:keepNext/>
+        <w:spacing w:line="240" w:lineRule="auto" w:before="80" w:after="40"/>
         <w:ind w:firstLine="0"/>
         <w:jc w:val="left"/>
       </w:pPr>
@@ -197,7 +198,8 @@
     <w:p>
       <w:pPr>
         <w:pStyle w:val="Heading1"/>
-        <w:spacing w:line="240" w:lineRule="auto" w:before="160" w:after="40"/>
+        <w:keepNext/>
+        <w:spacing w:line="240" w:lineRule="auto" w:before="80" w:after="40"/>
         <w:ind w:firstLine="0"/>
         <w:jc w:val="left"/>
       </w:pPr>
@@ -229,7 +231,8 @@
     <w:p>
       <w:pPr>
         <w:pStyle w:val="Heading2"/>
-        <w:spacing w:line="240" w:lineRule="auto" w:before="160" w:after="40"/>
+        <w:keepNext/>
+        <w:spacing w:line="240" w:lineRule="auto" w:before="80" w:after="40"/>
         <w:ind w:firstLine="0"/>
         <w:jc w:val="left"/>
       </w:pPr>
@@ -255,7 +258,7 @@
           <w:color w:val="000000"/>
           <w:sz w:val="28"/>
         </w:rPr>
-        <w:t>На собранной станции должен быть завершен полный аппаратный и программный цикл. В протоколе должны иметь статус PASS:</w:t>
+        <w:t>На собранной станции должен быть завершен полный аппаратный и программный цикл. Численные аппаратные пределы должны быть утверждены. В протоколе должны иметь статус PASS:</w:t>
       </w:r>
     </w:p>
     <w:p>
@@ -410,23 +413,9 @@
     </w:p>
     <w:p>
       <w:pPr>
-        <w:spacing w:line="240" w:lineRule="auto" w:before="0" w:after="0"/>
-        <w:ind w:firstLine="709"/>
-        <w:jc w:val="both"/>
-      </w:pPr>
-      <w:r>
-        <w:rPr>
-          <w:rFonts w:ascii="Times New Roman" w:hAnsi="Times New Roman" w:eastAsia="Times New Roman"/>
-          <w:color w:val="000000"/>
-          <w:sz w:val="28"/>
-        </w:rPr>
-        <w:t>До утверждения численных аппаратных пределов квалификация не считается завершенной.</w:t>
-      </w:r>
-    </w:p>
-    <w:p>
-      <w:pPr>
         <w:pStyle w:val="Heading2"/>
-        <w:spacing w:line="240" w:lineRule="auto" w:before="160" w:after="40"/>
+        <w:keepNext/>
+        <w:spacing w:line="240" w:lineRule="auto" w:before="80" w:after="40"/>
         <w:ind w:firstLine="0"/>
         <w:jc w:val="left"/>
       </w:pPr>
@@ -452,12 +441,12 @@
           <w:color w:val="000000"/>
           <w:sz w:val="28"/>
         </w:rPr>
-        <w:t>После квалификации выпускается отдельный production release ID и отдельный профиль option bytes. Стендовый профиль нельзя редактировать и превращать в профиль блокировки. Решение должно содержать:</w:t>
+        <w:t>После квалификации выпускается отдельный профиль защиты. Он получает новый production release ID и собственный набор option bytes. Стендовый профиль нельзя редактировать и превращать в профиль блокировки. Решение должно содержать:</w:t>
       </w:r>
     </w:p>
     <w:p>
       <w:pPr>
-        <w:spacing w:line="240" w:lineRule="auto" w:before="0" w:after="0"/>
+        <w:spacing w:line="240" w:lineRule="auto" w:before="0" w:after="40"/>
         <w:ind w:left="709" w:hanging="357"/>
         <w:jc w:val="both"/>
       </w:pPr>
@@ -472,7 +461,7 @@
     </w:p>
     <w:p>
       <w:pPr>
-        <w:spacing w:line="240" w:lineRule="auto" w:before="0" w:after="0"/>
+        <w:spacing w:line="240" w:lineRule="auto" w:before="0" w:after="40"/>
         <w:ind w:left="709" w:hanging="357"/>
         <w:jc w:val="both"/>
       </w:pPr>
@@ -487,7 +476,7 @@
     </w:p>
     <w:p>
       <w:pPr>
-        <w:spacing w:line="240" w:lineRule="auto" w:before="0" w:after="0"/>
+        <w:spacing w:line="240" w:lineRule="auto" w:before="0" w:after="40"/>
         <w:ind w:left="709" w:hanging="357"/>
         <w:jc w:val="both"/>
       </w:pPr>
@@ -502,7 +491,7 @@
     </w:p>
     <w:p>
       <w:pPr>
-        <w:spacing w:line="240" w:lineRule="auto" w:before="0" w:after="0"/>
+        <w:spacing w:line="240" w:lineRule="auto" w:before="0" w:after="40"/>
         <w:ind w:left="709" w:hanging="357"/>
         <w:jc w:val="both"/>
       </w:pPr>
@@ -517,7 +506,7 @@
     </w:p>
     <w:p>
       <w:pPr>
-        <w:spacing w:line="240" w:lineRule="auto" w:before="0" w:after="0"/>
+        <w:spacing w:line="240" w:lineRule="auto" w:before="0" w:after="40"/>
         <w:ind w:left="709" w:hanging="357"/>
         <w:jc w:val="both"/>
       </w:pPr>
@@ -532,7 +521,7 @@
     </w:p>
     <w:p>
       <w:pPr>
-        <w:spacing w:line="240" w:lineRule="auto" w:before="0" w:after="0"/>
+        <w:spacing w:line="240" w:lineRule="auto" w:before="0" w:after="40"/>
         <w:ind w:left="709" w:hanging="357"/>
         <w:jc w:val="both"/>
       </w:pPr>
@@ -547,7 +536,7 @@
     </w:p>
     <w:p>
       <w:pPr>
-        <w:spacing w:line="240" w:lineRule="auto" w:before="0" w:after="0"/>
+        <w:spacing w:line="240" w:lineRule="auto" w:before="0" w:after="40"/>
         <w:ind w:left="709" w:hanging="357"/>
         <w:jc w:val="both"/>
       </w:pPr>
@@ -572,13 +561,14 @@
           <w:color w:val="000000"/>
           <w:sz w:val="28"/>
         </w:rPr>
-        <w:t>RDP Level 2 остается запрещенным, пока он не будет отдельно утвержден как необратимое продуктовое решение. Его нельзя включать общим разрешением на производственную защиту.</w:t>
+        <w:t>RDP Level 2 остается запрещенным. Разрешить его можно только отдельным решением, которое прямо фиксирует необратимость операции. Общее разрешение на производственную защиту не позволяет включать RDP Level 2.</w:t>
       </w:r>
     </w:p>
     <w:p>
       <w:pPr>
         <w:pStyle w:val="Heading2"/>
-        <w:spacing w:line="240" w:lineRule="auto" w:before="160" w:after="40"/>
+        <w:keepNext/>
+        <w:spacing w:line="240" w:lineRule="auto" w:before="80" w:after="40"/>
         <w:ind w:firstLine="0"/>
         <w:jc w:val="left"/>
       </w:pPr>
@@ -604,7 +594,7 @@
           <w:color w:val="000000"/>
           <w:sz w:val="28"/>
         </w:rPr>
-        <w:t>Даже после выпуска production-профиля блокировка конкретной станции допускается только после ее собственного EOL PASS. До блокировки должны совпасть serial, station ID, ревизии плат, хэши прошивок, сертификат, SIM и traveller. Не допускаются открытые NCR, незавершенные проверки и временные параметры.</w:t>
+        <w:t>После выпуска production-профиля каждая станция проходит собственный EOL. Блокировка конкретной станции допускается только при результате EOL PASS.</w:t>
       </w:r>
     </w:p>
     <w:p>
@@ -619,13 +609,29 @@
           <w:color w:val="000000"/>
           <w:sz w:val="28"/>
         </w:rPr>
-        <w:t>После применения защиты оператор обязан считать доступное состояние защиты, выполнить холодный запуск, проверку версии, heartbeat, тестовое событие и подтверждение приема сервером. Результат и логи прикладываются к traveller станции.</w:t>
+        <w:t>До блокировки сверяют serial, station ID и ревизии плат. Отдельно сверяют хэши прошивок, сертификат, SIM и traveller. Открытые NCR, незавершенные проверки и временные параметры не допускаются.</w:t>
+      </w:r>
+    </w:p>
+    <w:p>
+      <w:pPr>
+        <w:spacing w:line="240" w:lineRule="auto" w:before="0" w:after="0"/>
+        <w:ind w:firstLine="709"/>
+        <w:jc w:val="both"/>
+      </w:pPr>
+      <w:r>
+        <w:rPr>
+          <w:rFonts w:ascii="Times New Roman" w:hAnsi="Times New Roman" w:eastAsia="Times New Roman"/>
+          <w:color w:val="000000"/>
+          <w:sz w:val="28"/>
+        </w:rPr>
+        <w:t>После применения защиты оператор считывает доступное состояние защиты и выполняет холодный запуск. Затем оператор проверяет версию и heartbeat. После этого станция отправляет тестовое событие и получает подтверждение сервера. Результат и логи прикладываются к traveller станции.</w:t>
       </w:r>
     </w:p>
     <w:p>
       <w:pPr>
         <w:pStyle w:val="Heading1"/>
-        <w:spacing w:line="240" w:lineRule="auto" w:before="160" w:after="40"/>
+        <w:keepNext/>
+        <w:spacing w:line="240" w:lineRule="auto" w:before="80" w:after="40"/>
         <w:ind w:firstLine="0"/>
         <w:jc w:val="left"/>
       </w:pPr>
@@ -641,7 +647,7 @@
     </w:p>
     <w:p>
       <w:pPr>
-        <w:spacing w:line="240" w:lineRule="auto" w:before="0" w:after="0"/>
+        <w:spacing w:line="240" w:lineRule="auto" w:before="0" w:after="60"/>
         <w:ind w:firstLine="709"/>
         <w:jc w:val="both"/>
       </w:pPr>
@@ -656,7 +662,7 @@
     </w:p>
     <w:p>
       <w:pPr>
-        <w:spacing w:line="240" w:lineRule="auto" w:before="0" w:after="0"/>
+        <w:spacing w:line="240" w:lineRule="auto" w:before="0" w:after="40"/>
         <w:ind w:left="709" w:hanging="357"/>
         <w:jc w:val="both"/>
       </w:pPr>
@@ -671,7 +677,7 @@
     </w:p>
     <w:p>
       <w:pPr>
-        <w:spacing w:line="240" w:lineRule="auto" w:before="0" w:after="0"/>
+        <w:spacing w:line="240" w:lineRule="auto" w:before="0" w:after="40"/>
         <w:ind w:left="709" w:hanging="357"/>
         <w:jc w:val="both"/>
       </w:pPr>
@@ -686,7 +692,7 @@
     </w:p>
     <w:p>
       <w:pPr>
-        <w:spacing w:line="240" w:lineRule="auto" w:before="0" w:after="0"/>
+        <w:spacing w:line="240" w:lineRule="auto" w:before="0" w:after="40"/>
         <w:ind w:left="709" w:hanging="357"/>
         <w:jc w:val="both"/>
       </w:pPr>
@@ -701,7 +707,7 @@
     </w:p>
     <w:p>
       <w:pPr>
-        <w:spacing w:line="240" w:lineRule="auto" w:before="0" w:after="0"/>
+        <w:spacing w:line="240" w:lineRule="auto" w:before="0" w:after="40"/>
         <w:ind w:left="709" w:hanging="357"/>
         <w:jc w:val="both"/>
       </w:pPr>
@@ -716,7 +722,7 @@
     </w:p>
     <w:p>
       <w:pPr>
-        <w:spacing w:line="240" w:lineRule="auto" w:before="0" w:after="0"/>
+        <w:spacing w:line="240" w:lineRule="auto" w:before="0" w:after="40"/>
         <w:ind w:left="709" w:hanging="357"/>
         <w:jc w:val="both"/>
       </w:pPr>
@@ -731,7 +737,7 @@
     </w:p>
     <w:p>
       <w:pPr>
-        <w:spacing w:line="240" w:lineRule="auto" w:before="0" w:after="0"/>
+        <w:spacing w:line="240" w:lineRule="auto" w:before="0" w:after="40"/>
         <w:ind w:left="709" w:hanging="357"/>
         <w:jc w:val="both"/>
       </w:pPr>
@@ -746,7 +752,7 @@
     </w:p>
     <w:p>
       <w:pPr>
-        <w:spacing w:line="240" w:lineRule="auto" w:before="0" w:after="0"/>
+        <w:spacing w:line="240" w:lineRule="auto" w:before="0" w:after="40"/>
         <w:ind w:left="709" w:hanging="357"/>
         <w:jc w:val="both"/>
       </w:pPr>
@@ -777,7 +783,8 @@
     <w:p>
       <w:pPr>
         <w:pStyle w:val="Heading1"/>
-        <w:spacing w:line="240" w:lineRule="auto" w:before="160" w:after="40"/>
+        <w:keepNext/>
+        <w:spacing w:line="240" w:lineRule="auto" w:before="80" w:after="40"/>
         <w:ind w:firstLine="0"/>
         <w:jc w:val="left"/>
       </w:pPr>
@@ -803,8 +810,15 @@
           <w:color w:val="000000"/>
           <w:sz w:val="28"/>
         </w:rPr>
-        <w:t xml:space="preserve">Нормативная машиночитаемая политика находится в </w:t>
+        <w:t>Нормативная машиночитаемая политика хранится в файле:</w:t>
       </w:r>
+    </w:p>
+    <w:p>
+      <w:pPr>
+        <w:spacing w:line="240" w:lineRule="auto" w:before="0" w:after="0"/>
+        <w:ind/>
+        <w:jc w:val="left"/>
+      </w:pPr>
       <w:r>
         <w:rPr>
           <w:rFonts w:ascii="Times New Roman" w:hAnsi="Times New Roman" w:eastAsia="Times New Roman"/>
@@ -813,14 +827,28 @@
         </w:rPr>
         <w:t>firmware/targets/evt_pre_20/release/firmware_lock_interlock_rev_a.json</w:t>
       </w:r>
+    </w:p>
+    <w:p>
+      <w:pPr>
+        <w:spacing w:line="240" w:lineRule="auto" w:before="0" w:after="0"/>
+        <w:ind w:firstLine="709"/>
+        <w:jc w:val="both"/>
+      </w:pPr>
       <w:r>
         <w:rPr>
           <w:rFonts w:ascii="Times New Roman" w:hAnsi="Times New Roman" w:eastAsia="Times New Roman"/>
           <w:color w:val="000000"/>
           <w:sz w:val="28"/>
         </w:rPr>
-        <w:t xml:space="preserve">. Проверка </w:t>
+        <w:t>Проверку выполняет программа:</w:t>
       </w:r>
+    </w:p>
+    <w:p>
+      <w:pPr>
+        <w:spacing w:line="240" w:lineRule="auto" w:before="0" w:after="0"/>
+        <w:ind/>
+        <w:jc w:val="left"/>
+      </w:pPr>
       <w:r>
         <w:rPr>
           <w:rFonts w:ascii="Times New Roman" w:hAnsi="Times New Roman" w:eastAsia="Times New Roman"/>
@@ -829,19 +857,27 @@
         </w:rPr>
         <w:t>tools/validate_firmware_lock_interlock.py</w:t>
       </w:r>
+    </w:p>
+    <w:p>
+      <w:pPr>
+        <w:spacing w:line="240" w:lineRule="auto" w:before="0" w:after="0"/>
+        <w:ind w:firstLine="709"/>
+        <w:jc w:val="both"/>
+      </w:pPr>
       <w:r>
         <w:rPr>
           <w:rFonts w:ascii="Times New Roman" w:hAnsi="Times New Roman" w:eastAsia="Times New Roman"/>
           <w:color w:val="000000"/>
           <w:sz w:val="28"/>
         </w:rPr>
-        <w:t xml:space="preserve"> контролирует безопасное состояние стендового профиля, наличие трех ворот и соответствие release contract. CI должен завершиться ошибкой, если стендовый профиль допускает необратимые изменения или если release contract объявляет блокировку допустимой до аппаратной квалификации.</w:t>
+        <w:t>Она контролирует безопасное состояние стендового профиля, наличие трех ворот и соответствие release contract. CI завершается ошибкой, если стендовый профиль допускает необратимые изменения. Ошибка также формируется, если release contract разрешает блокировку до аппаратной квалификации.</w:t>
       </w:r>
     </w:p>
     <w:p>
       <w:pPr>
         <w:pStyle w:val="Heading1"/>
-        <w:spacing w:line="240" w:lineRule="auto" w:before="160" w:after="40"/>
+        <w:keepNext/>
+        <w:spacing w:line="240" w:lineRule="auto" w:before="80" w:after="40"/>
         <w:ind w:firstLine="0"/>
         <w:jc w:val="left"/>
       </w:pPr>
@@ -867,8 +903,15 @@
           <w:color w:val="000000"/>
           <w:sz w:val="28"/>
         </w:rPr>
-        <w:t xml:space="preserve">До аппаратных испытаний применяется состояние </w:t>
+        <w:t>До аппаратных испытаний действует состояние:</w:t>
       </w:r>
+    </w:p>
+    <w:p>
+      <w:pPr>
+        <w:spacing w:line="240" w:lineRule="auto" w:before="0" w:after="0"/>
+        <w:ind/>
+        <w:jc w:val="left"/>
+      </w:pPr>
       <w:r>
         <w:rPr>
           <w:rFonts w:ascii="Times New Roman" w:hAnsi="Times New Roman" w:eastAsia="Times New Roman"/>
@@ -877,19 +920,27 @@
         </w:rPr>
         <w:t>LOCK_FORBIDDEN_HARDWARE_VALIDATION_PENDING</w:t>
       </w:r>
+    </w:p>
+    <w:p>
+      <w:pPr>
+        <w:spacing w:line="240" w:lineRule="auto" w:before="0" w:after="0"/>
+        <w:ind w:firstLine="709"/>
+        <w:jc w:val="both"/>
+      </w:pPr>
       <w:r>
         <w:rPr>
           <w:rFonts w:ascii="Times New Roman" w:hAnsi="Times New Roman" w:eastAsia="Times New Roman"/>
           <w:color w:val="000000"/>
           <w:sz w:val="28"/>
         </w:rPr>
-        <w:t>. После полного PASS выпускается новый документ и новый production release. Изменение статуса в одном файле, ручная правка option bytes или устное разрешение не заменяют выпускной комплект и подписанный протокол.</w:t>
+        <w:t>После полного PASS выпускаются новый документ и новый production release. Статус нельзя изменить отдельной правкой файла, ручной записью option bytes или устным разрешением. Основанием служат только выпускной комплект и подписанный протокол.</w:t>
       </w:r>
     </w:p>
     <w:p>
       <w:pPr>
         <w:pStyle w:val="Heading1"/>
-        <w:spacing w:line="240" w:lineRule="auto" w:before="160" w:after="40"/>
+        <w:keepNext/>
+        <w:spacing w:line="240" w:lineRule="auto" w:before="80" w:after="40"/>
         <w:ind w:firstLine="0"/>
         <w:jc w:val="left"/>
       </w:pPr>
@@ -915,7 +966,67 @@
           <w:color w:val="000000"/>
           <w:sz w:val="28"/>
         </w:rPr>
-        <w:t>Firmware locking is forbidden for the current bench release. The bench option-byte profile must keep RDP Level 0, SWD and BOOT0 recovery, and must not enable TrustZone, BOOT_LOCK, WRP or PCROP. A separate production protection release may be issued only after complete target validation on real hardware, full regression with approved numeric limits, and two-person release approval. Each station may be locked only after its own EOL PASS and identity verification. Post-lock boot, version, heartbeat and server event receipt checks are mandatory. RDP Level 2 requires a separate explicit irreversible-product decision.</w:t>
+        <w:t>Firmware locking is forbidden for the current bench release.</w:t>
+      </w:r>
+    </w:p>
+    <w:p>
+      <w:pPr>
+        <w:spacing w:line="240" w:lineRule="auto" w:before="0" w:after="0"/>
+        <w:ind w:firstLine="709"/>
+        <w:jc w:val="both"/>
+      </w:pPr>
+      <w:r>
+        <w:rPr>
+          <w:rFonts w:ascii="Times New Roman" w:hAnsi="Times New Roman" w:eastAsia="Times New Roman"/>
+          <w:color w:val="000000"/>
+          <w:sz w:val="28"/>
+        </w:rPr>
+        <w:t>The bench option-byte profile must keep RDP Level 0, SWD and BOOT0 recovery. It must not enable TrustZone, BOOT_LOCK, WRP or PCROP.</w:t>
+      </w:r>
+    </w:p>
+    <w:p>
+      <w:pPr>
+        <w:spacing w:line="240" w:lineRule="auto" w:before="0" w:after="0"/>
+        <w:ind w:firstLine="709"/>
+        <w:jc w:val="both"/>
+      </w:pPr>
+      <w:r>
+        <w:rPr>
+          <w:rFonts w:ascii="Times New Roman" w:hAnsi="Times New Roman" w:eastAsia="Times New Roman"/>
+          <w:color w:val="000000"/>
+          <w:sz w:val="28"/>
+        </w:rPr>
+        <w:t>A production protection release may be issued only after complete target validation on real hardware. Full regression, approved numeric limits and two-person approval are mandatory.</w:t>
+      </w:r>
+    </w:p>
+    <w:p>
+      <w:pPr>
+        <w:spacing w:line="240" w:lineRule="auto" w:before="0" w:after="0"/>
+        <w:ind w:firstLine="709"/>
+        <w:jc w:val="both"/>
+      </w:pPr>
+      <w:r>
+        <w:rPr>
+          <w:rFonts w:ascii="Times New Roman" w:hAnsi="Times New Roman" w:eastAsia="Times New Roman"/>
+          <w:color w:val="000000"/>
+          <w:sz w:val="28"/>
+        </w:rPr>
+        <w:t>Each station may be locked only after its own EOL PASS and identity verification. Post-lock boot, version, heartbeat and server event receipt checks are mandatory.</w:t>
+      </w:r>
+    </w:p>
+    <w:p>
+      <w:pPr>
+        <w:spacing w:line="240" w:lineRule="auto" w:before="0" w:after="0"/>
+        <w:ind w:firstLine="709"/>
+        <w:jc w:val="both"/>
+      </w:pPr>
+      <w:r>
+        <w:rPr>
+          <w:rFonts w:ascii="Times New Roman" w:hAnsi="Times New Roman" w:eastAsia="Times New Roman"/>
+          <w:color w:val="000000"/>
+          <w:sz w:val="28"/>
+        </w:rPr>
+        <w:t>RDP Level 2 requires a separate explicit irreversible-product decision.</w:t>
       </w:r>
     </w:p>
     <w:sectPr>
@@ -1658,9 +1769,6 @@
     <w:qFormat/>
     <w:rsid w:val="00FC693F"/>
     <w:pPr>
-      <w:pBdr>
-        <w:bottom w:val="single" w:sz="8" w:space="4" w:color="4F81BD" w:themeColor="accent1"/>
-      </w:pBdr>
       <w:spacing w:after="300" w:line="240" w:lineRule="auto"/>
       <w:contextualSpacing/>
     </w:pPr>

</xml_diff>